<commit_message>
updated press release & email template
</commit_message>
<xml_diff>
--- a/Secret Santa Press Release.docx
+++ b/Secret Santa Press Release.docx
@@ -55,7 +55,16 @@
           <w:sz w:val="28"/>
           <w:szCs w:val="28"/>
         </w:rPr>
-        <w:t>Contact: Dan Basar, President, Base Capital Group, LLC</w:t>
+        <w:t xml:space="preserve">Contact: Dan Basar, President, Base Capital Group, </w:t>
+      </w:r>
+      <w:proofErr w:type="gramStart"/>
+      <w:r>
+        <w:rPr>
+          <w:rFonts w:asciiTheme="majorHAnsi" w:hAnsiTheme="majorHAnsi"/>
+          <w:sz w:val="28"/>
+          <w:szCs w:val="28"/>
+        </w:rPr>
+        <w:t>LLC</w:t>
       </w:r>
       <w:r>
         <w:rPr>
@@ -75,6 +84,7 @@
         </w:rPr>
         <w:t>|</w:t>
       </w:r>
+      <w:proofErr w:type="gramEnd"/>
       <w:r>
         <w:rPr>
           <w:rFonts w:asciiTheme="majorHAnsi" w:hAnsiTheme="majorHAnsi"/>
@@ -83,21 +93,42 @@
         </w:rPr>
         <w:t xml:space="preserve">  </w:t>
       </w:r>
+      <w:proofErr w:type="spellStart"/>
       <w:r>
         <w:rPr>
           <w:rFonts w:asciiTheme="majorHAnsi" w:hAnsiTheme="majorHAnsi"/>
           <w:sz w:val="28"/>
           <w:szCs w:val="28"/>
         </w:rPr>
-        <w:t>baseworkshop.app</w:t>
-      </w:r>
-    </w:p>
-    <w:p>
-      <w:r>
-        <w:rPr>
-          <w:noProof/>
-        </w:rPr>
-      </w:r>
+        <w:t>B</w:t>
+      </w:r>
+      <w:r>
+        <w:rPr>
+          <w:rFonts w:asciiTheme="majorHAnsi" w:hAnsiTheme="majorHAnsi"/>
+          <w:sz w:val="28"/>
+          <w:szCs w:val="28"/>
+        </w:rPr>
+        <w:t>ase</w:t>
+      </w:r>
+      <w:r>
+        <w:rPr>
+          <w:rFonts w:asciiTheme="majorHAnsi" w:hAnsiTheme="majorHAnsi"/>
+          <w:sz w:val="28"/>
+          <w:szCs w:val="28"/>
+        </w:rPr>
+        <w:t>W</w:t>
+      </w:r>
+      <w:r>
+        <w:rPr>
+          <w:rFonts w:asciiTheme="majorHAnsi" w:hAnsiTheme="majorHAnsi"/>
+          <w:sz w:val="28"/>
+          <w:szCs w:val="28"/>
+        </w:rPr>
+        <w:t>orkshop.app</w:t>
+      </w:r>
+      <w:proofErr w:type="spellEnd"/>
+    </w:p>
+    <w:p>
       <w:r>
         <w:rPr>
           <w:noProof/>
@@ -136,72 +167,101 @@
           <w:i/>
           <w:iCs/>
         </w:rPr>
-        <w:t xml:space="preserve">Flagship app Secret Santa Picker now live at </w:t>
-      </w:r>
+        <w:t xml:space="preserve">Flagship app Secret Santa Picker now </w:t>
+      </w:r>
+      <w:proofErr w:type="gramStart"/>
       <w:r>
         <w:rPr>
           <w:i/>
           <w:iCs/>
         </w:rPr>
-        <w:t>B</w:t>
-      </w:r>
+        <w:t>live</w:t>
+      </w:r>
+      <w:proofErr w:type="gramEnd"/>
       <w:r>
         <w:rPr>
           <w:i/>
           <w:iCs/>
         </w:rPr>
-        <w:t>ase</w:t>
-      </w:r>
+        <w:t xml:space="preserve"> at </w:t>
+      </w:r>
+      <w:proofErr w:type="spellStart"/>
       <w:r>
         <w:rPr>
           <w:i/>
           <w:iCs/>
         </w:rPr>
-        <w:t>W</w:t>
+        <w:t>B</w:t>
       </w:r>
       <w:r>
         <w:rPr>
           <w:i/>
           <w:iCs/>
         </w:rPr>
+        <w:t>ase</w:t>
+      </w:r>
+      <w:r>
+        <w:rPr>
+          <w:i/>
+          <w:iCs/>
+        </w:rPr>
+        <w:t>W</w:t>
+      </w:r>
+      <w:r>
+        <w:rPr>
+          <w:i/>
+          <w:iCs/>
+        </w:rPr>
         <w:t>orkshop.app</w:t>
       </w:r>
-    </w:p>
-    <w:p/>
-    <w:p>
-      <w:r>
-        <w:t>Columbus, Ohio</w:t>
-      </w:r>
-      <w:r>
-        <w:t xml:space="preserve"> – </w:t>
-      </w:r>
-      <w:r>
-        <w:t xml:space="preserve">Base Capital Group, LLC today announced the launch of Base Workshop, a new software trade name and brand umbrella under which the company will develop and publish </w:t>
-      </w:r>
-      <w:r>
-        <w:t xml:space="preserve">AI-native </w:t>
-      </w:r>
-      <w:r>
-        <w:t xml:space="preserve">consumer and productivity applications. The inaugural release under the Base Workshop banner is the </w:t>
-      </w:r>
+      <w:proofErr w:type="spellEnd"/>
+    </w:p>
+    <w:p>
       <w:r>
         <w:rPr>
           <w:b/>
           <w:bCs/>
         </w:rPr>
+        <w:t>Columbus, Ohio</w:t>
+      </w:r>
+      <w:r>
+        <w:t xml:space="preserve"> – </w:t>
+      </w:r>
+      <w:r>
+        <w:t xml:space="preserve">Base Capital Group, LLC today announced the launch of Base Workshop, a new software trade name and brand umbrella under which the company will develop and publish </w:t>
+      </w:r>
+      <w:r>
+        <w:t xml:space="preserve">AI-native </w:t>
+      </w:r>
+      <w:r>
+        <w:t xml:space="preserve">consumer and productivity applications. The inaugural release under the Base Workshop banner is the </w:t>
+      </w:r>
+      <w:r>
+        <w:rPr>
+          <w:b/>
+          <w:bCs/>
+        </w:rPr>
         <w:t>Secret Santa Picker</w:t>
       </w:r>
       <w:r>
         <w:t>, a free web application that streamlines Secret Santa gift exchanges of any size</w:t>
       </w:r>
       <w:r>
-        <w:t>,</w:t>
-      </w:r>
-      <w:r>
-        <w:t xml:space="preserve"> from a handful of family members to entire offices.</w:t>
-      </w:r>
-      <w:r>
-        <w:t xml:space="preserve"> Base Workshop can be found online at</w:t>
+        <w:t xml:space="preserve"> and complexity</w:t>
+      </w:r>
+      <w:r>
+        <w:t>.</w:t>
+      </w:r>
+      <w:r>
+        <w:t xml:space="preserve"> Base Workshop can </w:t>
+      </w:r>
+      <w:bookmarkStart w:id="0" w:name="_Int_88eOboXU"/>
+      <w:r>
+        <w:t>be found</w:t>
+      </w:r>
+      <w:bookmarkEnd w:id="0"/>
+      <w:r>
+        <w:t xml:space="preserve"> at</w:t>
       </w:r>
       <w:r>
         <w:t xml:space="preserve"> </w:t>
@@ -211,7 +271,7 @@
           <w:rPr>
             <w:rStyle w:val="Hyperlink"/>
           </w:rPr>
-          <w:t>www.BaseWorkshop.app</w:t>
+          <w:t>BaseWorkshop.app</w:t>
         </w:r>
       </w:hyperlink>
       <w:r>
@@ -250,7 +310,7 @@
         </w:numPr>
       </w:pPr>
       <w:r>
-        <w:t>Participant management with optional group assignments</w:t>
+        <w:t>Smart draw algorithm that respects group exclusion rules</w:t>
       </w:r>
     </w:p>
     <w:p>
@@ -261,7 +321,13 @@
         </w:numPr>
       </w:pPr>
       <w:r>
-        <w:t>Smart draw algorithm that respects group exclusion rules</w:t>
+        <w:t xml:space="preserve">Automated email delivery </w:t>
+      </w:r>
+      <w:r>
+        <w:t xml:space="preserve">– </w:t>
+      </w:r>
+      <w:r>
+        <w:t>each participant receives only their own assignment</w:t>
       </w:r>
     </w:p>
     <w:p>
@@ -272,7 +338,7 @@
         </w:numPr>
       </w:pPr>
       <w:r>
-        <w:t>Automated email delivery — each participant receives only their own assignment</w:t>
+        <w:t>Clean, mobile-friendly interface accessible from any device</w:t>
       </w:r>
     </w:p>
     <w:p>
@@ -283,17 +349,6 @@
         </w:numPr>
       </w:pPr>
       <w:r>
-        <w:t>Clean, mobile-friendly interface accessible from any device</w:t>
-      </w:r>
-    </w:p>
-    <w:p>
-      <w:pPr>
-        <w:numPr>
-          <w:ilvl w:val="0"/>
-          <w:numId w:val="1"/>
-        </w:numPr>
-      </w:pPr>
-      <w:r>
         <w:t>No account required for participants</w:t>
       </w:r>
     </w:p>
@@ -308,6 +363,7 @@
     </w:p>
     <w:p>
       <w:r>
+        <w:lastRenderedPageBreak/>
         <w:t>Base Workshop is a</w:t>
       </w:r>
       <w:r>
@@ -343,7 +399,15 @@
     </w:p>
     <w:p>
       <w:r>
-        <w:t>The Secret Santa Picker is the first of multiple apps planned under the Base Workshop umbrella. Future releases are expected to span productivity, personal organization, and collaboration — all reflecting the same commitment to thoughtful, people-first design.</w:t>
+        <w:t xml:space="preserve">The Secret Santa Picker is the first of multiple apps planned under the Base Workshop umbrella. Future releases are expected to span productivity, personal organization, and collaboration — all </w:t>
+      </w:r>
+      <w:proofErr w:type="gramStart"/>
+      <w:r>
+        <w:t>reflecting</w:t>
+      </w:r>
+      <w:proofErr w:type="gramEnd"/>
+      <w:r>
+        <w:t xml:space="preserve"> the same commitment to thoughtful, people-first design.</w:t>
       </w:r>
     </w:p>
     <w:p>
@@ -426,9 +490,15 @@
     <w:p>
       <w:pPr>
         <w:jc w:val="center"/>
+        <w:rPr>
+          <w:b/>
+          <w:bCs/>
+        </w:rPr>
       </w:pPr>
       <w:r>
         <w:rPr>
+          <w:b/>
+          <w:bCs/>
           <w:i/>
           <w:iCs/>
         </w:rPr>
@@ -443,6 +513,18 @@
     </w:sectPr>
   </w:body>
 </w:document>
+</file>
+
+<file path=word/intelligence2.xml><?xml version="1.0" encoding="utf-8"?>
+<int2:intelligence xmlns:int2="http://schemas.microsoft.com/office/intelligence/2020/intelligence" xmlns:oel="http://schemas.microsoft.com/office/2019/extlst">
+  <int2:observations>
+    <int2:bookmark int2:bookmarkName="_Int_88eOboXU" int2:invalidationBookmarkName="" int2:hashCode="4/ByatqIm0XAMC" int2:id="fOIJcVEL">
+      <int2:state int2:value="Rejected" int2:type="style"/>
+    </int2:bookmark>
+  </int2:observations>
+  <int2:intelligenceSettings/>
+  <int2:onDemandWorkflows/>
+</int2:intelligence>
 </file>
 
 <file path=word/numbering.xml><?xml version="1.0" encoding="utf-8"?>
@@ -1542,6 +1624,18 @@
       <w:shd w:val="clear" w:color="auto" w:fill="E1DFDD"/>
     </w:rPr>
   </w:style>
+  <w:style w:type="character" w:styleId="FollowedHyperlink">
+    <w:name w:val="FollowedHyperlink"/>
+    <w:basedOn w:val="DefaultParagraphFont"/>
+    <w:uiPriority w:val="99"/>
+    <w:semiHidden/>
+    <w:unhideWhenUsed/>
+    <w:rsid w:val="00FC7EF2"/>
+    <w:rPr>
+      <w:color w:val="96607D" w:themeColor="followedHyperlink"/>
+      <w:u w:val="single"/>
+    </w:rPr>
+  </w:style>
 </w:styles>
 </file>
 

</xml_diff>